<commit_message>
feat(Q3): movie list screen with hooks and empty state
</commit_message>
<xml_diff>
--- a/minhchung.docx
+++ b/minhchung.docx
@@ -23,7 +23,7 @@
           <wp:inline distT="0" distB="0" distL="114300" distR="114300">
             <wp:extent cx="5266690" cy="2962910"/>
             <wp:effectExtent l="0" t="0" r="6350" b="8890"/>
-            <wp:docPr id="1" name="Picture 1"/>
+            <wp:docPr id="2" name="Picture 2"/>
             <wp:cNvGraphicFramePr>
               <a:graphicFrameLocks xmlns:a="http://schemas.openxmlformats.org/drawingml/2006/main" noChangeAspect="1"/>
             </wp:cNvGraphicFramePr>
@@ -31,7 +31,7 @@
               <a:graphicData uri="http://schemas.openxmlformats.org/drawingml/2006/picture">
                 <pic:pic xmlns:pic="http://schemas.openxmlformats.org/drawingml/2006/picture">
                   <pic:nvPicPr>
-                    <pic:cNvPr id="1" name="Picture 1"/>
+                    <pic:cNvPr id="2" name="Picture 2"/>
                     <pic:cNvPicPr>
                       <a:picLocks noChangeAspect="1"/>
                     </pic:cNvPicPr>
@@ -70,8 +70,256 @@
           <w:lang w:val="en-US"/>
         </w:rPr>
       </w:pPr>
+      <w:r>
+        <w:rPr>
+          <w:rFonts w:hint="default"/>
+          <w:lang w:val="en-US"/>
+        </w:rPr>
+        <w:t>Câu 2:</w:t>
+      </w:r>
+    </w:p>
+    <w:p>
+      <w:r>
+        <w:drawing>
+          <wp:inline distT="0" distB="0" distL="114300" distR="114300">
+            <wp:extent cx="5266690" cy="2962910"/>
+            <wp:effectExtent l="0" t="0" r="6350" b="8890"/>
+            <wp:docPr id="3" name="Picture 3"/>
+            <wp:cNvGraphicFramePr>
+              <a:graphicFrameLocks xmlns:a="http://schemas.openxmlformats.org/drawingml/2006/main" noChangeAspect="1"/>
+            </wp:cNvGraphicFramePr>
+            <a:graphic xmlns:a="http://schemas.openxmlformats.org/drawingml/2006/main">
+              <a:graphicData uri="http://schemas.openxmlformats.org/drawingml/2006/picture">
+                <pic:pic xmlns:pic="http://schemas.openxmlformats.org/drawingml/2006/picture">
+                  <pic:nvPicPr>
+                    <pic:cNvPr id="3" name="Picture 3"/>
+                    <pic:cNvPicPr>
+                      <a:picLocks noChangeAspect="1"/>
+                    </pic:cNvPicPr>
+                  </pic:nvPicPr>
+                  <pic:blipFill>
+                    <a:blip r:embed="rId5"/>
+                    <a:stretch>
+                      <a:fillRect/>
+                    </a:stretch>
+                  </pic:blipFill>
+                  <pic:spPr>
+                    <a:xfrm>
+                      <a:off x="0" y="0"/>
+                      <a:ext cx="5266690" cy="2962910"/>
+                    </a:xfrm>
+                    <a:prstGeom prst="rect">
+                      <a:avLst/>
+                    </a:prstGeom>
+                    <a:noFill/>
+                    <a:ln>
+                      <a:noFill/>
+                    </a:ln>
+                  </pic:spPr>
+                </pic:pic>
+              </a:graphicData>
+            </a:graphic>
+          </wp:inline>
+        </w:drawing>
+      </w:r>
+    </w:p>
+    <w:p/>
+    <w:p>
+      <w:pPr>
+        <w:rPr>
+          <w:rFonts w:hint="default"/>
+          <w:lang w:val="en-US"/>
+        </w:rPr>
+      </w:pPr>
+    </w:p>
+    <w:p>
+      <w:pPr>
+        <w:rPr>
+          <w:rFonts w:hint="default"/>
+          <w:lang w:val="en-US"/>
+        </w:rPr>
+      </w:pPr>
+    </w:p>
+    <w:p>
+      <w:pPr>
+        <w:rPr>
+          <w:rFonts w:hint="default"/>
+          <w:lang w:val="en-US"/>
+        </w:rPr>
+      </w:pPr>
+    </w:p>
+    <w:p>
+      <w:pPr>
+        <w:rPr>
+          <w:rFonts w:hint="default"/>
+          <w:lang w:val="en-US"/>
+        </w:rPr>
+      </w:pPr>
+    </w:p>
+    <w:p>
+      <w:pPr>
+        <w:rPr>
+          <w:rFonts w:hint="default"/>
+          <w:lang w:val="en-US"/>
+        </w:rPr>
+      </w:pPr>
+    </w:p>
+    <w:p>
+      <w:pPr>
+        <w:rPr>
+          <w:rFonts w:hint="default"/>
+          <w:lang w:val="en-US"/>
+        </w:rPr>
+      </w:pPr>
+    </w:p>
+    <w:p>
+      <w:pPr>
+        <w:rPr>
+          <w:rFonts w:hint="default"/>
+          <w:lang w:val="en-US"/>
+        </w:rPr>
+      </w:pPr>
+    </w:p>
+    <w:p>
+      <w:pPr>
+        <w:rPr>
+          <w:rFonts w:hint="default"/>
+          <w:lang w:val="en-US"/>
+        </w:rPr>
+      </w:pPr>
+    </w:p>
+    <w:p>
+      <w:pPr>
+        <w:rPr>
+          <w:rFonts w:hint="default"/>
+          <w:lang w:val="en-US"/>
+        </w:rPr>
+      </w:pPr>
+    </w:p>
+    <w:p>
+      <w:pPr>
+        <w:rPr>
+          <w:rFonts w:hint="default"/>
+          <w:lang w:val="en-US"/>
+        </w:rPr>
+      </w:pPr>
+    </w:p>
+    <w:p>
+      <w:pPr>
+        <w:rPr>
+          <w:rFonts w:hint="default"/>
+          <w:lang w:val="en-US"/>
+        </w:rPr>
+      </w:pPr>
+    </w:p>
+    <w:p>
+      <w:pPr>
+        <w:rPr>
+          <w:rFonts w:hint="default"/>
+          <w:lang w:val="en-US"/>
+        </w:rPr>
+      </w:pPr>
+    </w:p>
+    <w:p>
+      <w:pPr>
+        <w:rPr>
+          <w:rFonts w:hint="default"/>
+          <w:lang w:val="en-US"/>
+        </w:rPr>
+      </w:pPr>
+    </w:p>
+    <w:p>
+      <w:pPr>
+        <w:rPr>
+          <w:rFonts w:hint="default"/>
+          <w:lang w:val="en-US"/>
+        </w:rPr>
+      </w:pPr>
+    </w:p>
+    <w:p>
+      <w:pPr>
+        <w:rPr>
+          <w:rFonts w:hint="default"/>
+          <w:lang w:val="en-US"/>
+        </w:rPr>
+      </w:pPr>
       <w:bookmarkStart w:id="0" w:name="_GoBack"/>
       <w:bookmarkEnd w:id="0"/>
+      <w:r>
+        <w:rPr>
+          <w:rFonts w:hint="default"/>
+          <w:lang w:val="en-US"/>
+        </w:rPr>
+        <w:t>Câu 3:</w:t>
+      </w:r>
+    </w:p>
+    <w:p>
+      <w:pPr>
+        <w:rPr>
+          <w:rFonts w:hint="default"/>
+          <w:lang w:val="en-US"/>
+        </w:rPr>
+      </w:pPr>
+      <w:r>
+        <w:drawing>
+          <wp:inline distT="0" distB="0" distL="114300" distR="114300">
+            <wp:extent cx="5266690" cy="2962910"/>
+            <wp:effectExtent l="0" t="0" r="6350" b="8890"/>
+            <wp:docPr id="4" name="Picture 4"/>
+            <wp:cNvGraphicFramePr>
+              <a:graphicFrameLocks xmlns:a="http://schemas.openxmlformats.org/drawingml/2006/main" noChangeAspect="1"/>
+            </wp:cNvGraphicFramePr>
+            <a:graphic xmlns:a="http://schemas.openxmlformats.org/drawingml/2006/main">
+              <a:graphicData uri="http://schemas.openxmlformats.org/drawingml/2006/picture">
+                <pic:pic xmlns:pic="http://schemas.openxmlformats.org/drawingml/2006/picture">
+                  <pic:nvPicPr>
+                    <pic:cNvPr id="4" name="Picture 4"/>
+                    <pic:cNvPicPr>
+                      <a:picLocks noChangeAspect="1"/>
+                    </pic:cNvPicPr>
+                  </pic:nvPicPr>
+                  <pic:blipFill>
+                    <a:blip r:embed="rId6"/>
+                    <a:stretch>
+                      <a:fillRect/>
+                    </a:stretch>
+                  </pic:blipFill>
+                  <pic:spPr>
+                    <a:xfrm>
+                      <a:off x="0" y="0"/>
+                      <a:ext cx="5266690" cy="2962910"/>
+                    </a:xfrm>
+                    <a:prstGeom prst="rect">
+                      <a:avLst/>
+                    </a:prstGeom>
+                    <a:noFill/>
+                    <a:ln>
+                      <a:noFill/>
+                    </a:ln>
+                  </pic:spPr>
+                </pic:pic>
+              </a:graphicData>
+            </a:graphic>
+          </wp:inline>
+        </w:drawing>
+      </w:r>
+    </w:p>
+    <w:p/>
+    <w:p>
+      <w:pPr>
+        <w:rPr>
+          <w:rFonts w:hint="default"/>
+          <w:lang w:val="en-US"/>
+        </w:rPr>
+      </w:pPr>
+    </w:p>
+    <w:p>
+      <w:pPr>
+        <w:rPr>
+          <w:rFonts w:hint="default"/>
+          <w:lang w:val="en-US"/>
+        </w:rPr>
+      </w:pPr>
     </w:p>
     <w:sectPr>
       <w:pgSz w:w="11906" w:h="16838"/>

</xml_diff>

<commit_message>
feat(Q4): add movie modal with validation
</commit_message>
<xml_diff>
--- a/minhchung.docx
+++ b/minhchung.docx
@@ -243,8 +243,6 @@
           <w:lang w:val="en-US"/>
         </w:rPr>
       </w:pPr>
-      <w:bookmarkStart w:id="0" w:name="_GoBack"/>
-      <w:bookmarkEnd w:id="0"/>
       <w:r>
         <w:rPr>
           <w:rFonts w:hint="default"/>
@@ -254,12 +252,6 @@
       </w:r>
     </w:p>
     <w:p>
-      <w:pPr>
-        <w:rPr>
-          <w:rFonts w:hint="default"/>
-          <w:lang w:val="en-US"/>
-        </w:rPr>
-      </w:pPr>
       <w:r>
         <w:drawing>
           <wp:inline distT="0" distB="0" distL="114300" distR="114300">
@@ -303,6 +295,79 @@
           </wp:inline>
         </w:drawing>
       </w:r>
+    </w:p>
+    <w:p/>
+    <w:p/>
+    <w:p>
+      <w:pPr>
+        <w:rPr>
+          <w:rFonts w:hint="default"/>
+          <w:lang w:val="en-US"/>
+        </w:rPr>
+      </w:pPr>
+      <w:r>
+        <w:rPr>
+          <w:rFonts w:hint="default"/>
+          <w:lang w:val="en-US"/>
+        </w:rPr>
+        <w:t>Câu 4:</w:t>
+      </w:r>
+    </w:p>
+    <w:p>
+      <w:r>
+        <w:drawing>
+          <wp:inline distT="0" distB="0" distL="114300" distR="114300">
+            <wp:extent cx="5266690" cy="2962910"/>
+            <wp:effectExtent l="0" t="0" r="6350" b="8890"/>
+            <wp:docPr id="6" name="Picture 6"/>
+            <wp:cNvGraphicFramePr>
+              <a:graphicFrameLocks xmlns:a="http://schemas.openxmlformats.org/drawingml/2006/main" noChangeAspect="1"/>
+            </wp:cNvGraphicFramePr>
+            <a:graphic xmlns:a="http://schemas.openxmlformats.org/drawingml/2006/main">
+              <a:graphicData uri="http://schemas.openxmlformats.org/drawingml/2006/picture">
+                <pic:pic xmlns:pic="http://schemas.openxmlformats.org/drawingml/2006/picture">
+                  <pic:nvPicPr>
+                    <pic:cNvPr id="6" name="Picture 6"/>
+                    <pic:cNvPicPr>
+                      <a:picLocks noChangeAspect="1"/>
+                    </pic:cNvPicPr>
+                  </pic:nvPicPr>
+                  <pic:blipFill>
+                    <a:blip r:embed="rId7"/>
+                    <a:stretch>
+                      <a:fillRect/>
+                    </a:stretch>
+                  </pic:blipFill>
+                  <pic:spPr>
+                    <a:xfrm>
+                      <a:off x="0" y="0"/>
+                      <a:ext cx="5266690" cy="2962910"/>
+                    </a:xfrm>
+                    <a:prstGeom prst="rect">
+                      <a:avLst/>
+                    </a:prstGeom>
+                    <a:noFill/>
+                    <a:ln>
+                      <a:noFill/>
+                    </a:ln>
+                  </pic:spPr>
+                </pic:pic>
+              </a:graphicData>
+            </a:graphic>
+          </wp:inline>
+        </w:drawing>
+      </w:r>
+      <w:bookmarkStart w:id="0" w:name="_GoBack"/>
+      <w:bookmarkEnd w:id="0"/>
+    </w:p>
+    <w:p/>
+    <w:p>
+      <w:pPr>
+        <w:rPr>
+          <w:rFonts w:hint="default"/>
+          <w:lang w:val="en-US"/>
+        </w:rPr>
+      </w:pPr>
     </w:p>
     <w:p/>
     <w:p>

</xml_diff>

<commit_message>
feat(Q5): toggle watched state for movie
</commit_message>
<xml_diff>
--- a/minhchung.docx
+++ b/minhchung.docx
@@ -357,6 +357,195 @@
           </wp:inline>
         </w:drawing>
       </w:r>
+    </w:p>
+    <w:p/>
+    <w:p>
+      <w:pPr>
+        <w:rPr>
+          <w:rFonts w:hint="default"/>
+          <w:lang w:val="en-US"/>
+        </w:rPr>
+      </w:pPr>
+    </w:p>
+    <w:p>
+      <w:pPr>
+        <w:rPr>
+          <w:rFonts w:hint="default"/>
+          <w:lang w:val="en-US"/>
+        </w:rPr>
+      </w:pPr>
+    </w:p>
+    <w:p>
+      <w:pPr>
+        <w:rPr>
+          <w:rFonts w:hint="default"/>
+          <w:lang w:val="en-US"/>
+        </w:rPr>
+      </w:pPr>
+    </w:p>
+    <w:p>
+      <w:pPr>
+        <w:rPr>
+          <w:rFonts w:hint="default"/>
+          <w:lang w:val="en-US"/>
+        </w:rPr>
+      </w:pPr>
+    </w:p>
+    <w:p>
+      <w:pPr>
+        <w:rPr>
+          <w:rFonts w:hint="default"/>
+          <w:lang w:val="en-US"/>
+        </w:rPr>
+      </w:pPr>
+    </w:p>
+    <w:p>
+      <w:pPr>
+        <w:rPr>
+          <w:rFonts w:hint="default"/>
+          <w:lang w:val="en-US"/>
+        </w:rPr>
+      </w:pPr>
+    </w:p>
+    <w:p>
+      <w:pPr>
+        <w:rPr>
+          <w:rFonts w:hint="default"/>
+          <w:lang w:val="en-US"/>
+        </w:rPr>
+      </w:pPr>
+    </w:p>
+    <w:p>
+      <w:pPr>
+        <w:rPr>
+          <w:rFonts w:hint="default"/>
+          <w:lang w:val="en-US"/>
+        </w:rPr>
+      </w:pPr>
+    </w:p>
+    <w:p>
+      <w:pPr>
+        <w:rPr>
+          <w:rFonts w:hint="default"/>
+          <w:lang w:val="en-US"/>
+        </w:rPr>
+      </w:pPr>
+    </w:p>
+    <w:p>
+      <w:pPr>
+        <w:rPr>
+          <w:rFonts w:hint="default"/>
+          <w:lang w:val="en-US"/>
+        </w:rPr>
+      </w:pPr>
+    </w:p>
+    <w:p>
+      <w:pPr>
+        <w:rPr>
+          <w:rFonts w:hint="default"/>
+          <w:lang w:val="en-US"/>
+        </w:rPr>
+      </w:pPr>
+    </w:p>
+    <w:p>
+      <w:pPr>
+        <w:rPr>
+          <w:rFonts w:hint="default"/>
+          <w:lang w:val="en-US"/>
+        </w:rPr>
+      </w:pPr>
+    </w:p>
+    <w:p>
+      <w:pPr>
+        <w:rPr>
+          <w:rFonts w:hint="default"/>
+          <w:lang w:val="en-US"/>
+        </w:rPr>
+      </w:pPr>
+    </w:p>
+    <w:p>
+      <w:pPr>
+        <w:rPr>
+          <w:rFonts w:hint="default"/>
+          <w:lang w:val="en-US"/>
+        </w:rPr>
+      </w:pPr>
+      <w:r>
+        <w:rPr>
+          <w:rFonts w:hint="default"/>
+          <w:lang w:val="en-US"/>
+        </w:rPr>
+        <w:t>Câu 5:</w:t>
+      </w:r>
+    </w:p>
+    <w:p>
+      <w:r>
+        <w:drawing>
+          <wp:inline distT="0" distB="0" distL="114300" distR="114300">
+            <wp:extent cx="5266690" cy="2962910"/>
+            <wp:effectExtent l="0" t="0" r="6350" b="8890"/>
+            <wp:docPr id="7" name="Picture 7"/>
+            <wp:cNvGraphicFramePr>
+              <a:graphicFrameLocks xmlns:a="http://schemas.openxmlformats.org/drawingml/2006/main" noChangeAspect="1"/>
+            </wp:cNvGraphicFramePr>
+            <a:graphic xmlns:a="http://schemas.openxmlformats.org/drawingml/2006/main">
+              <a:graphicData uri="http://schemas.openxmlformats.org/drawingml/2006/picture">
+                <pic:pic xmlns:pic="http://schemas.openxmlformats.org/drawingml/2006/picture">
+                  <pic:nvPicPr>
+                    <pic:cNvPr id="7" name="Picture 7"/>
+                    <pic:cNvPicPr>
+                      <a:picLocks noChangeAspect="1"/>
+                    </pic:cNvPicPr>
+                  </pic:nvPicPr>
+                  <pic:blipFill>
+                    <a:blip r:embed="rId8"/>
+                    <a:stretch>
+                      <a:fillRect/>
+                    </a:stretch>
+                  </pic:blipFill>
+                  <pic:spPr>
+                    <a:xfrm>
+                      <a:off x="0" y="0"/>
+                      <a:ext cx="5266690" cy="2962910"/>
+                    </a:xfrm>
+                    <a:prstGeom prst="rect">
+                      <a:avLst/>
+                    </a:prstGeom>
+                    <a:noFill/>
+                    <a:ln>
+                      <a:noFill/>
+                    </a:ln>
+                  </pic:spPr>
+                </pic:pic>
+              </a:graphicData>
+            </a:graphic>
+          </wp:inline>
+        </w:drawing>
+      </w:r>
+    </w:p>
+    <w:p/>
+    <w:p>
+      <w:pPr>
+        <w:rPr>
+          <w:rFonts w:hint="default"/>
+          <w:lang w:val="en-US"/>
+        </w:rPr>
+      </w:pPr>
+      <w:r>
+        <w:rPr>
+          <w:rFonts w:hint="default"/>
+          <w:lang w:val="en-US"/>
+        </w:rPr>
+        <w:t>Câu 6:</w:t>
+      </w:r>
+    </w:p>
+    <w:p>
+      <w:pPr>
+        <w:rPr>
+          <w:rFonts w:hint="default"/>
+          <w:lang w:val="en-US"/>
+        </w:rPr>
+      </w:pPr>
       <w:bookmarkStart w:id="0" w:name="_GoBack"/>
       <w:bookmarkEnd w:id="0"/>
     </w:p>

</xml_diff>

<commit_message>
feat(Q6): edit movie via modal
</commit_message>
<xml_diff>
--- a/minhchung.docx
+++ b/minhchung.docx
@@ -540,6 +540,112 @@
       </w:r>
     </w:p>
     <w:p>
+      <w:r>
+        <w:drawing>
+          <wp:inline distT="0" distB="0" distL="114300" distR="114300">
+            <wp:extent cx="5266690" cy="2962910"/>
+            <wp:effectExtent l="0" t="0" r="6350" b="8890"/>
+            <wp:docPr id="8" name="Picture 8"/>
+            <wp:cNvGraphicFramePr>
+              <a:graphicFrameLocks xmlns:a="http://schemas.openxmlformats.org/drawingml/2006/main" noChangeAspect="1"/>
+            </wp:cNvGraphicFramePr>
+            <a:graphic xmlns:a="http://schemas.openxmlformats.org/drawingml/2006/main">
+              <a:graphicData uri="http://schemas.openxmlformats.org/drawingml/2006/picture">
+                <pic:pic xmlns:pic="http://schemas.openxmlformats.org/drawingml/2006/picture">
+                  <pic:nvPicPr>
+                    <pic:cNvPr id="8" name="Picture 8"/>
+                    <pic:cNvPicPr>
+                      <a:picLocks noChangeAspect="1"/>
+                    </pic:cNvPicPr>
+                  </pic:nvPicPr>
+                  <pic:blipFill>
+                    <a:blip r:embed="rId9"/>
+                    <a:stretch>
+                      <a:fillRect/>
+                    </a:stretch>
+                  </pic:blipFill>
+                  <pic:spPr>
+                    <a:xfrm>
+                      <a:off x="0" y="0"/>
+                      <a:ext cx="5266690" cy="2962910"/>
+                    </a:xfrm>
+                    <a:prstGeom prst="rect">
+                      <a:avLst/>
+                    </a:prstGeom>
+                    <a:noFill/>
+                    <a:ln>
+                      <a:noFill/>
+                    </a:ln>
+                  </pic:spPr>
+                </pic:pic>
+              </a:graphicData>
+            </a:graphic>
+          </wp:inline>
+        </w:drawing>
+      </w:r>
+    </w:p>
+    <w:p>
+      <w:r>
+        <w:drawing>
+          <wp:inline distT="0" distB="0" distL="114300" distR="114300">
+            <wp:extent cx="5266690" cy="2962910"/>
+            <wp:effectExtent l="0" t="0" r="6350" b="8890"/>
+            <wp:docPr id="9" name="Picture 9"/>
+            <wp:cNvGraphicFramePr>
+              <a:graphicFrameLocks xmlns:a="http://schemas.openxmlformats.org/drawingml/2006/main" noChangeAspect="1"/>
+            </wp:cNvGraphicFramePr>
+            <a:graphic xmlns:a="http://schemas.openxmlformats.org/drawingml/2006/main">
+              <a:graphicData uri="http://schemas.openxmlformats.org/drawingml/2006/picture">
+                <pic:pic xmlns:pic="http://schemas.openxmlformats.org/drawingml/2006/picture">
+                  <pic:nvPicPr>
+                    <pic:cNvPr id="9" name="Picture 9"/>
+                    <pic:cNvPicPr>
+                      <a:picLocks noChangeAspect="1"/>
+                    </pic:cNvPicPr>
+                  </pic:nvPicPr>
+                  <pic:blipFill>
+                    <a:blip r:embed="rId10"/>
+                    <a:stretch>
+                      <a:fillRect/>
+                    </a:stretch>
+                  </pic:blipFill>
+                  <pic:spPr>
+                    <a:xfrm>
+                      <a:off x="0" y="0"/>
+                      <a:ext cx="5266690" cy="2962910"/>
+                    </a:xfrm>
+                    <a:prstGeom prst="rect">
+                      <a:avLst/>
+                    </a:prstGeom>
+                    <a:noFill/>
+                    <a:ln>
+                      <a:noFill/>
+                    </a:ln>
+                  </pic:spPr>
+                </pic:pic>
+              </a:graphicData>
+            </a:graphic>
+          </wp:inline>
+        </w:drawing>
+      </w:r>
+    </w:p>
+    <w:p/>
+    <w:p>
+      <w:pPr>
+        <w:rPr>
+          <w:rFonts w:hint="default"/>
+          <w:lang w:val="en-US"/>
+        </w:rPr>
+      </w:pPr>
+      <w:r>
+        <w:rPr>
+          <w:rFonts w:hint="default"/>
+          <w:lang w:val="en-US"/>
+        </w:rPr>
+        <w:t>Câu 7:</w:t>
+      </w:r>
+    </w:p>
+    <w:p>
       <w:pPr>
         <w:rPr>
           <w:rFonts w:hint="default"/>
@@ -548,6 +654,33 @@
       </w:pPr>
       <w:bookmarkStart w:id="0" w:name="_GoBack"/>
       <w:bookmarkEnd w:id="0"/>
+    </w:p>
+    <w:p>
+      <w:pPr>
+        <w:rPr>
+          <w:rFonts w:hint="default"/>
+          <w:lang w:val="en-US"/>
+        </w:rPr>
+      </w:pPr>
+    </w:p>
+    <w:p/>
+    <w:p/>
+    <w:p/>
+    <w:p/>
+    <w:p/>
+    <w:p/>
+    <w:p/>
+    <w:p/>
+    <w:p/>
+    <w:p/>
+    <w:p/>
+    <w:p>
+      <w:pPr>
+        <w:rPr>
+          <w:rFonts w:hint="default"/>
+          <w:lang w:val="en-US"/>
+        </w:rPr>
+      </w:pPr>
     </w:p>
     <w:p/>
     <w:p>

</xml_diff>

<commit_message>
feat(Q7): delete movie with confirm
</commit_message>
<xml_diff>
--- a/minhchung.docx
+++ b/minhchung.docx
@@ -646,14 +646,75 @@
       </w:r>
     </w:p>
     <w:p>
-      <w:pPr>
-        <w:rPr>
-          <w:rFonts w:hint="default"/>
-          <w:lang w:val="en-US"/>
-        </w:rPr>
-      </w:pPr>
       <w:bookmarkStart w:id="0" w:name="_GoBack"/>
+      <w:r>
+        <w:drawing>
+          <wp:inline distT="0" distB="0" distL="114300" distR="114300">
+            <wp:extent cx="5266690" cy="2962910"/>
+            <wp:effectExtent l="0" t="0" r="6350" b="8890"/>
+            <wp:docPr id="10" name="Picture 10"/>
+            <wp:cNvGraphicFramePr>
+              <a:graphicFrameLocks xmlns:a="http://schemas.openxmlformats.org/drawingml/2006/main" noChangeAspect="1"/>
+            </wp:cNvGraphicFramePr>
+            <a:graphic xmlns:a="http://schemas.openxmlformats.org/drawingml/2006/main">
+              <a:graphicData uri="http://schemas.openxmlformats.org/drawingml/2006/picture">
+                <pic:pic xmlns:pic="http://schemas.openxmlformats.org/drawingml/2006/picture">
+                  <pic:nvPicPr>
+                    <pic:cNvPr id="10" name="Picture 10"/>
+                    <pic:cNvPicPr>
+                      <a:picLocks noChangeAspect="1"/>
+                    </pic:cNvPicPr>
+                  </pic:nvPicPr>
+                  <pic:blipFill>
+                    <a:blip r:embed="rId11"/>
+                    <a:stretch>
+                      <a:fillRect/>
+                    </a:stretch>
+                  </pic:blipFill>
+                  <pic:spPr>
+                    <a:xfrm>
+                      <a:off x="0" y="0"/>
+                      <a:ext cx="5266690" cy="2962910"/>
+                    </a:xfrm>
+                    <a:prstGeom prst="rect">
+                      <a:avLst/>
+                    </a:prstGeom>
+                    <a:noFill/>
+                    <a:ln>
+                      <a:noFill/>
+                    </a:ln>
+                  </pic:spPr>
+                </pic:pic>
+              </a:graphicData>
+            </a:graphic>
+          </wp:inline>
+        </w:drawing>
+      </w:r>
       <w:bookmarkEnd w:id="0"/>
+    </w:p>
+    <w:p/>
+    <w:p>
+      <w:pPr>
+        <w:rPr>
+          <w:rFonts w:hint="default"/>
+          <w:lang w:val="en-US"/>
+        </w:rPr>
+      </w:pPr>
+      <w:r>
+        <w:rPr>
+          <w:rFonts w:hint="default"/>
+          <w:lang w:val="en-US"/>
+        </w:rPr>
+        <w:t>Câu 8:</w:t>
+      </w:r>
+    </w:p>
+    <w:p>
+      <w:pPr>
+        <w:rPr>
+          <w:rFonts w:hint="default"/>
+          <w:lang w:val="en-US"/>
+        </w:rPr>
+      </w:pPr>
     </w:p>
     <w:p>
       <w:pPr>

</xml_diff>